<commit_message>
Tighten the pages to the PowerPoint and update the owner guide.
The header uses the white wordmark with its flat background removed, the Constellation and Growth Model sit tight to the artwork, and the section spacing is closer to the mock-ups. The guide now asks Dan to replace the photographs in the admin and notes the Cursor credit cost for ccdesigner.
</commit_message>
<xml_diff>
--- a/docs/website-owner-guide.docx
+++ b/docs/website-owner-guide.docx
@@ -1804,6 +1804,270 @@
           <w:sz w:val="24"/>
         </w:rPr>
         <w:t>Questions about the wording can be answered by editing the preview yourself, using the steps above, or by sending the replacement text to whoever is looking after the build.</w:t>
+      </w:r>
+    </w:p>
+    <w:p>
+      <w:pPr>
+        <w:spacing w:before="320" w:after="120"/>
+      </w:pPr>
+      <w:r>
+        <w:rPr>
+          <w:rFonts w:ascii="Calibri" w:hAnsi="Calibri" w:eastAsia="Calibri"/>
+          <w:b/>
+          <w:i w:val="0"/>
+          <w:color w:val="14362F"/>
+          <w:sz w:val="40"/>
+        </w:rPr>
+        <w:t>11. Dan, please replace the photographs</w:t>
+      </w:r>
+    </w:p>
+    <w:p>
+      <w:pPr>
+        <w:spacing w:after="160"/>
+      </w:pPr>
+      <w:r>
+        <w:rPr>
+          <w:rFonts w:ascii="Calibri" w:hAnsi="Calibri" w:eastAsia="Calibri"/>
+          <w:b w:val="0"/>
+          <w:i w:val="0"/>
+          <w:color w:val="1C1916"/>
+          <w:sz w:val="24"/>
+        </w:rPr>
+        <w:t>Dan, the photographs on the People page, other than yours, are placeholders taken from the PowerPoint. Please replace them yourself in the admin. You do not need to ask anyone else to do this.</w:t>
+      </w:r>
+    </w:p>
+    <w:p>
+      <w:pPr>
+        <w:pStyle w:val="ListBullet"/>
+        <w:spacing w:after="80"/>
+      </w:pPr>
+      <w:r>
+        <w:rPr>
+          <w:rFonts w:ascii="Calibri" w:hAnsi="Calibri" w:eastAsia="Calibri"/>
+          <w:b w:val="0"/>
+          <w:i w:val="0"/>
+          <w:color w:val="1C1916"/>
+          <w:sz w:val="24"/>
+        </w:rPr>
+        <w:t>Go to https://dangpprevised.vercel.app/admin and sign in.</w:t>
+      </w:r>
+    </w:p>
+    <w:p>
+      <w:pPr>
+        <w:pStyle w:val="ListBullet"/>
+        <w:spacing w:after="80"/>
+      </w:pPr>
+      <w:r>
+        <w:rPr>
+          <w:rFonts w:ascii="Calibri" w:hAnsi="Calibri" w:eastAsia="Calibri"/>
+          <w:b w:val="0"/>
+          <w:i w:val="0"/>
+          <w:color w:val="1C1916"/>
+          <w:sz w:val="24"/>
+        </w:rPr>
+        <w:t>Open Media. Upload each new photograph and give it the person’s name as the description.</w:t>
+      </w:r>
+    </w:p>
+    <w:p>
+      <w:pPr>
+        <w:pStyle w:val="ListBullet"/>
+        <w:spacing w:after="80"/>
+      </w:pPr>
+      <w:r>
+        <w:rPr>
+          <w:rFonts w:ascii="Calibri" w:hAnsi="Calibri" w:eastAsia="Calibri"/>
+          <w:b w:val="0"/>
+          <w:i w:val="0"/>
+          <w:color w:val="1C1916"/>
+          <w:sz w:val="24"/>
+        </w:rPr>
+        <w:t>Open People, click the person, and choose that photograph under “Or choose from the library”.</w:t>
+      </w:r>
+    </w:p>
+    <w:p>
+      <w:pPr>
+        <w:pStyle w:val="ListBullet"/>
+        <w:spacing w:after="80"/>
+      </w:pPr>
+      <w:r>
+        <w:rPr>
+          <w:rFonts w:ascii="Calibri" w:hAnsi="Calibri" w:eastAsia="Calibri"/>
+          <w:b w:val="0"/>
+          <w:i w:val="0"/>
+          <w:color w:val="1C1916"/>
+          <w:sz w:val="24"/>
+        </w:rPr>
+        <w:t>Use the three crop sliders until the face sits properly in the frame.</w:t>
+      </w:r>
+    </w:p>
+    <w:p>
+      <w:pPr>
+        <w:pStyle w:val="ListBullet"/>
+        <w:spacing w:after="80"/>
+      </w:pPr>
+      <w:r>
+        <w:rPr>
+          <w:rFonts w:ascii="Calibri" w:hAnsi="Calibri" w:eastAsia="Calibri"/>
+          <w:b w:val="0"/>
+          <w:i w:val="0"/>
+          <w:color w:val="1C1916"/>
+          <w:sz w:val="24"/>
+        </w:rPr>
+        <w:t>Check the short biography at the same time and replace it if the PowerPoint line is not the wording you want published.</w:t>
+      </w:r>
+    </w:p>
+    <w:p>
+      <w:pPr>
+        <w:pStyle w:val="ListBullet"/>
+        <w:spacing w:after="80"/>
+      </w:pPr>
+      <w:r>
+        <w:rPr>
+          <w:rFonts w:ascii="Calibri" w:hAnsi="Calibri" w:eastAsia="Calibri"/>
+          <w:b w:val="0"/>
+          <w:i w:val="0"/>
+          <w:color w:val="1C1916"/>
+          <w:sz w:val="24"/>
+        </w:rPr>
+        <w:t>Press Save draft, open Preview, look at the People page, then press Publish.</w:t>
+      </w:r>
+    </w:p>
+    <w:p>
+      <w:pPr>
+        <w:spacing w:after="160"/>
+      </w:pPr>
+      <w:r>
+        <w:rPr>
+          <w:rFonts w:ascii="Calibri" w:hAnsi="Calibri" w:eastAsia="Calibri"/>
+          <w:b w:val="0"/>
+          <w:i w:val="0"/>
+          <w:color w:val="1C1916"/>
+          <w:sz w:val="24"/>
+        </w:rPr>
+        <w:t>Your own photograph is the one already used on the current website. Replace that in the same way if you would like a newer picture.</w:t>
+      </w:r>
+    </w:p>
+    <w:p>
+      <w:pPr>
+        <w:spacing w:before="320" w:after="120"/>
+      </w:pPr>
+      <w:r>
+        <w:rPr>
+          <w:rFonts w:ascii="Calibri" w:hAnsi="Calibri" w:eastAsia="Calibri"/>
+          <w:b/>
+          <w:i w:val="0"/>
+          <w:color w:val="14362F"/>
+          <w:sz w:val="40"/>
+        </w:rPr>
+        <w:t>12. How the pages sit against the PowerPoint</w:t>
+      </w:r>
+    </w:p>
+    <w:p>
+      <w:pPr>
+        <w:spacing w:after="160"/>
+      </w:pPr>
+      <w:r>
+        <w:rPr>
+          <w:rFonts w:ascii="Calibri" w:hAnsi="Calibri" w:eastAsia="Calibri"/>
+          <w:b w:val="0"/>
+          <w:i w:val="0"/>
+          <w:color w:val="1C1916"/>
+          <w:sz w:val="24"/>
+        </w:rPr>
+        <w:t>The pages have been tightened so they sit closer to the page mock-ups in the PowerPoint: a dark green bar at the top, less empty space between sections, and the pictures brought in so they are not floating in a large margin.</w:t>
+      </w:r>
+    </w:p>
+    <w:p>
+      <w:pPr>
+        <w:pStyle w:val="ListBullet"/>
+        <w:spacing w:after="80"/>
+      </w:pPr>
+      <w:r>
+        <w:rPr>
+          <w:rFonts w:ascii="Calibri" w:hAnsi="Calibri" w:eastAsia="Calibri"/>
+          <w:b w:val="0"/>
+          <w:i w:val="0"/>
+          <w:color w:val="1C1916"/>
+          <w:sz w:val="24"/>
+        </w:rPr>
+        <w:t>The logo on the dark bar is the white wordmark from the PowerPoint. The flat green square behind it in the brand slide was removed, so the letters sit directly on the bar. The green logo file was already transparent, and it is still kept if you want it on a light background.</w:t>
+      </w:r>
+    </w:p>
+    <w:p>
+      <w:pPr>
+        <w:pStyle w:val="ListBullet"/>
+        <w:spacing w:after="80"/>
+      </w:pPr>
+      <w:r>
+        <w:rPr>
+          <w:rFonts w:ascii="Calibri" w:hAnsi="Calibri" w:eastAsia="Calibri"/>
+          <w:b w:val="0"/>
+          <w:i w:val="0"/>
+          <w:color w:val="1C1916"/>
+          <w:sz w:val="24"/>
+        </w:rPr>
+        <w:t>The Constellation picture and the Growth Model diagram were not transparent in the original files. They have been cropped tight to the artwork. They have not been redrawn.</w:t>
+      </w:r>
+    </w:p>
+    <w:p>
+      <w:pPr>
+        <w:pStyle w:val="ListBullet"/>
+        <w:spacing w:after="80"/>
+      </w:pPr>
+      <w:r>
+        <w:rPr>
+          <w:rFonts w:ascii="Calibri" w:hAnsi="Calibri" w:eastAsia="Calibri"/>
+          <w:b w:val="0"/>
+          <w:i w:val="0"/>
+          <w:color w:val="1C1916"/>
+          <w:sz w:val="24"/>
+        </w:rPr>
+        <w:t>The Constellation on the Home and About pages is the version that sits on the dark background in the PowerPoint hero, so it meets the page without a pale box around it.</w:t>
+      </w:r>
+    </w:p>
+    <w:p>
+      <w:pPr>
+        <w:spacing w:before="320" w:after="120"/>
+      </w:pPr>
+      <w:r>
+        <w:rPr>
+          <w:rFonts w:ascii="Calibri" w:hAnsi="Calibri" w:eastAsia="Calibri"/>
+          <w:b/>
+          <w:i w:val="0"/>
+          <w:color w:val="14362F"/>
+          <w:sz w:val="40"/>
+        </w:rPr>
+        <w:t>13. A note on the cost of this work</w:t>
+      </w:r>
+    </w:p>
+    <w:p>
+      <w:pPr>
+        <w:spacing w:after="160"/>
+      </w:pPr>
+      <w:r>
+        <w:rPr>
+          <w:rFonts w:ascii="Calibri" w:hAnsi="Calibri" w:eastAsia="Calibri"/>
+          <w:b w:val="0"/>
+          <w:i w:val="0"/>
+          <w:color w:val="1C1916"/>
+          <w:sz w:val="24"/>
+        </w:rPr>
+        <w:t>This website work is for ccdesigner. It was prepared with Cursor’s AI tools, which are paid for with credits. This job has used quite a lot of those credits, and that cost will need to be recharged.</w:t>
+      </w:r>
+    </w:p>
+    <w:p>
+      <w:pPr>
+        <w:spacing w:after="160"/>
+      </w:pPr>
+      <w:r>
+        <w:rPr>
+          <w:rFonts w:ascii="Calibri" w:hAnsi="Calibri" w:eastAsia="Calibri"/>
+          <w:b w:val="0"/>
+          <w:i w:val="0"/>
+          <w:color w:val="1C1916"/>
+          <w:sz w:val="24"/>
+        </w:rPr>
+        <w:t>It should not be a large amount. The estimate is about £30 to £50. The exact figure will be taken from the usage record before it is added, and it will be shown separately so it is clear what it covers.</w:t>
       </w:r>
     </w:p>
     <w:sectPr>

</xml_diff>